<commit_message>
OV02 Path A recut: vision-independent synthesis grader+golden; prereg/A0.5; cold bench = fair floor, GO for re-pilot
</commit_message>
<xml_diff>
--- a/worlds/ondina-vasquell/phase-3-build-task-artifacts/platform/task2/current/golden-OV02-v6.docx
+++ b/worlds/ondina-vasquell/phase-3-build-task-artifacts/platform/task2/current/golden-OV02-v6.docx
@@ -580,7 +580,7 @@
           <w:color w:val="232830"/>
           <w:sz w:val="19"/>
         </w:rPr>
-        <w:t>Skilled nursing for ongoing wound care and rehabilitation after a limb-threatening left diabetic foot infection, with a newly identified intravenous line-site infection that must be addressed before transfer.</w:t>
+        <w:t>Skilled nursing for ongoing wound care and rehabilitation after a limb-threatening left diabetic foot infection, with a new intravenous line-site infection identified on transfer day that must be assessed and managed before transfer.</w:t>
       </w:r>
     </w:p>
     <w:p>
@@ -630,7 +630,7 @@
           <w:color w:val="232830"/>
           <w:sz w:val="19"/>
         </w:rPr>
-        <w:t>NEW intravenous line-site infection: the transfer-day line-site photo shows erythema and purulent drainage at the catheter site, with a low-grade temperature of 38.0. A new active problem.</w:t>
+        <w:t>NEW intravenous line-site infection (new active problem): on transfer day a line-site photograph was specifically obtained and a new low-grade temperature of 38.0 appeared while the patient had been afebrile, with intravenous antibiotics running through that same line; taken together these establish a line-site infection that must be addressed before transfer. The line-site photograph corroborates erythema and purulent drainage at the catheter site.</w:t>
       </w:r>
     </w:p>
     <w:p>

</xml_diff>